<commit_message>
supplier media integration complete
</commit_message>
<xml_diff>
--- a/frontend/mobile/assets/bulk-import/TRU_Connect_Bulk_Import_Guide.docx
+++ b/frontend/mobile/assets/bulk-import/TRU_Connect_Bulk_Import_Guide.docx
@@ -490,6 +490,138 @@
                 <w:b/>
                 <w:bCs/>
               </w:rPr>
+              <w:t xml:space="preserve">sku</w:t>
+            </w:r>
+          </w:p>
+        </w:tc>
+        <w:tc>
+          <w:tcPr>
+            <w:tcW w:type="dxa" w:w="1400"/>
+          </w:tcPr>
+          <w:p>
+            <w:r>
+              <w:rPr>
+                <w:b w:val="false"/>
+                <w:bCs w:val="false"/>
+              </w:rPr>
+              <w:t xml:space="preserve">Optional</w:t>
+            </w:r>
+          </w:p>
+        </w:tc>
+        <w:tc>
+          <w:tcPr>
+            <w:tcW w:type="dxa" w:w="5600"/>
+          </w:tcPr>
+          <w:p>
+            <w:r>
+              <w:rPr>
+                <w:b w:val="false"/>
+                <w:bCs w:val="false"/>
+              </w:rPr>
+              <w:t xml:space="preserve">Your own tracking label. Leave blank and TRU Connect generates one for you automatically.</w:t>
+            </w:r>
+          </w:p>
+        </w:tc>
+      </w:tr>
+      <w:tr>
+        <w:tc>
+          <w:tcPr>
+            <w:tcW w:type="dxa" w:w="2200"/>
+          </w:tcPr>
+          <w:p>
+            <w:r>
+              <w:rPr>
+                <w:b/>
+                <w:bCs/>
+              </w:rPr>
+              <w:t xml:space="preserve">description</w:t>
+            </w:r>
+          </w:p>
+        </w:tc>
+        <w:tc>
+          <w:tcPr>
+            <w:tcW w:type="dxa" w:w="1400"/>
+          </w:tcPr>
+          <w:p>
+            <w:r>
+              <w:rPr>
+                <w:b w:val="false"/>
+                <w:bCs w:val="false"/>
+              </w:rPr>
+              <w:t xml:space="preserve">Optional</w:t>
+            </w:r>
+          </w:p>
+        </w:tc>
+        <w:tc>
+          <w:tcPr>
+            <w:tcW w:type="dxa" w:w="5600"/>
+          </w:tcPr>
+          <w:p>
+            <w:r>
+              <w:rPr>
+                <w:b w:val="false"/>
+                <w:bCs w:val="false"/>
+              </w:rPr>
+              <w:t xml:space="preserve">Plain text shown to businesses when they order, e.g. "3 loaves per case."</w:t>
+            </w:r>
+          </w:p>
+        </w:tc>
+      </w:tr>
+      <w:tr>
+        <w:tc>
+          <w:tcPr>
+            <w:tcW w:type="dxa" w:w="2200"/>
+          </w:tcPr>
+          <w:p>
+            <w:r>
+              <w:rPr>
+                <w:b/>
+                <w:bCs/>
+              </w:rPr>
+              <w:t xml:space="preserve">compare_at_price</w:t>
+            </w:r>
+          </w:p>
+        </w:tc>
+        <w:tc>
+          <w:tcPr>
+            <w:tcW w:type="dxa" w:w="1400"/>
+          </w:tcPr>
+          <w:p>
+            <w:r>
+              <w:rPr>
+                <w:b w:val="false"/>
+                <w:bCs w:val="false"/>
+              </w:rPr>
+              <w:t xml:space="preserve">Optional</w:t>
+            </w:r>
+          </w:p>
+        </w:tc>
+        <w:tc>
+          <w:tcPr>
+            <w:tcW w:type="dxa" w:w="5600"/>
+          </w:tcPr>
+          <w:p>
+            <w:r>
+              <w:rPr>
+                <w:b w:val="false"/>
+                <w:bCs w:val="false"/>
+              </w:rPr>
+              <w:t xml:space="preserve">The "was" price for a sale, e.g. 25.00. Must be higher than price, or the row will show an error. Leave blank if you're not running a sale.</w:t>
+            </w:r>
+          </w:p>
+        </w:tc>
+      </w:tr>
+      <w:tr>
+        <w:tc>
+          <w:tcPr>
+            <w:tcW w:type="dxa" w:w="2200"/>
+          </w:tcPr>
+          <w:p>
+            <w:r>
+              <w:rPr>
+                <w:b/>
+                <w:bCs/>
+              </w:rPr>
               <w:t xml:space="preserve">image_1</w:t>
             </w:r>
           </w:p>
@@ -1481,6 +1613,36 @@
                 <w:bCs w:val="false"/>
               </w:rPr>
               <w:t xml:space="preserve">The price cell isn't a plain number. Remove currency symbols, and use a full stop or comma for the decimal (12.00 or 12,00), not a space or letter.</w:t>
+            </w:r>
+          </w:p>
+        </w:tc>
+      </w:tr>
+      <w:tr>
+        <w:tc>
+          <w:tcPr>
+            <w:tcW w:type="dxa" w:w="3200"/>
+          </w:tcPr>
+          <w:p>
+            <w:r>
+              <w:rPr>
+                <w:b/>
+                <w:bCs/>
+              </w:rPr>
+              <w:t xml:space="preserve">"Compare-at price must be higher than the actual price"</w:t>
+            </w:r>
+          </w:p>
+        </w:tc>
+        <w:tc>
+          <w:tcPr>
+            <w:tcW w:type="dxa" w:w="6000"/>
+          </w:tcPr>
+          <w:p>
+            <w:r>
+              <w:rPr>
+                <w:b w:val="false"/>
+                <w:bCs w:val="false"/>
+              </w:rPr>
+              <w:t xml:space="preserve">The compare_at_price cell is the same as or lower than price. It only makes sense as a "was" price for a genuine discount -- either raise it above price, or leave it blank if you're not running a sale.</w:t>
             </w:r>
           </w:p>
         </w:tc>

</xml_diff>